<commit_message>
Improve remaining email templates — waitlist 9/10, reminders, support resolved
- Add emails 9 and 10 to lib/waitlist-nurture.ts (bug fix: bulk send was
  silently skipping them as getWaitlistNurtureEmail returned null)
- Rewrite Email 9 (CQC framework): prose-led, no subheadings, warm close
- Rewrite Email 10 (launch): prose features list, fixed grammar, warm close
- Refactor sendWaitlistLaunch in test-emails to use shared nurture module
  (test panel and actual bulk send now use identical content)
- Fix support resolved: 'We're getting in touch to let you know...' → direct
- Add closing paragraph to KLOE overdue and HR overdue reminders
- Minor: remove 'You're in good company' from waitlist confirmation
</commit_message>
<xml_diff>
--- a/docs/AlwaysReady FB posts.docx
+++ b/docs/AlwaysReady FB posts.docx
@@ -34,6 +34,7 @@
           <w14:ligatures w14:val="none"/>
         </w:rPr>
       </w:pPr>
+      <w:bookmarkStart w:id="0" w:name="OLE_LINK2"/>
       <w:r>
         <w:rPr>
           <w:rFonts w:ascii="Apple Color Emoji" w:eastAsia="Times New Roman" w:hAnsi="Apple Color Emoji" w:cs="Apple Color Emoji"/>
@@ -74,6 +75,7 @@
           <w14:ligatures w14:val="none"/>
         </w:rPr>
       </w:pPr>
+      <w:bookmarkStart w:id="1" w:name="OLE_LINK1"/>
       <w:r>
         <w:rPr>
           <w:rFonts w:ascii="Times New Roman" w:eastAsia="Times New Roman" w:hAnsi="Times New Roman" w:cs="Times New Roman"/>
@@ -244,24 +246,28 @@
         <w:t xml:space="preserve"> or follow our page for practical compliance insights!</w:t>
       </w:r>
     </w:p>
-    <w:p>
-      <w:pPr>
-        <w:rPr>
-          <w:rFonts w:ascii="Times New Roman" w:eastAsia="Times New Roman" w:hAnsi="Times New Roman" w:cs="Times New Roman"/>
-          <w:kern w:val="0"/>
-          <w:lang w:eastAsia="en-GB"/>
-          <w14:ligatures w14:val="none"/>
-        </w:rPr>
-      </w:pPr>
-      <w:r>
-        <w:rPr>
-          <w:rFonts w:ascii="Times New Roman" w:eastAsia="Times New Roman" w:hAnsi="Times New Roman" w:cs="Times New Roman"/>
+    <w:bookmarkEnd w:id="0"/>
+    <w:bookmarkEnd w:id="1"/>
+    <w:p>
+      <w:pPr>
+        <w:rPr>
+          <w:rFonts w:ascii="Times New Roman" w:eastAsia="Times New Roman" w:hAnsi="Times New Roman" w:cs="Times New Roman"/>
+          <w:kern w:val="0"/>
+          <w:lang w:eastAsia="en-GB"/>
+          <w14:ligatures w14:val="none"/>
+        </w:rPr>
+      </w:pPr>
+      <w:r>
+        <w:rPr>
           <w:noProof/>
-          <w:kern w:val="0"/>
-          <w:lang w:eastAsia="en-GB"/>
-        </w:rPr>
-        <w:pict w14:anchorId="44540B6D">
-          <v:rect id="_x0000_i1029" alt="" style="width:451.15pt;height:.05pt;mso-width-percent:0;mso-height-percent:0;mso-width-percent:0;mso-height-percent:0" o:hrpct="964" o:hralign="center" o:hrstd="t" o:hr="t" fillcolor="#a0a0a0" stroked="f"/>
+        </w:rPr>
+      </w:r>
+      <w:r>
+        <w:pict w14:anchorId="4B652630">
+          <v:rect id="Horizontal Line 1" o:spid="_x0000_s1029" style="width:451pt;height:.1pt;visibility:visible;mso-wrap-style:square;mso-left-percent:-10001;mso-top-percent:-10001;mso-position-horizontal:absolute;mso-position-horizontal-relative:char;mso-position-vertical:absolute;mso-position-vertical-relative:line;mso-left-percent:-10001;mso-top-percent:-10001;v-text-anchor:top" o:gfxdata="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" filled="f">
+            <o:lock v:ext="edit" rotation="t" aspectratio="t" verticies="t" text="t" shapetype="t"/>
+            <w10:anchorlock/>
+          </v:rect>
         </w:pict>
       </w:r>
     </w:p>
@@ -607,13 +613,15 @@
       </w:pPr>
       <w:r>
         <w:rPr>
-          <w:rFonts w:ascii="Times New Roman" w:eastAsia="Times New Roman" w:hAnsi="Times New Roman" w:cs="Times New Roman"/>
-          <w:kern w:val="0"/>
-          <w:lang w:eastAsia="en-GB"/>
-          <w14:ligatures w14:val="none"/>
-        </w:rPr>
-        <w:pict w14:anchorId="679CD02D">
-          <v:rect id="_x0000_i1026" style="width:0;height:1.5pt" o:hralign="center" o:hrstd="t" o:hr="t" fillcolor="#a0a0a0" stroked="f"/>
+          <w:noProof/>
+        </w:rPr>
+      </w:r>
+      <w:r>
+        <w:pict w14:anchorId="644154E5">
+          <v:rect id="Horizontal Line 2" o:spid="_x0000_s1028" style="width:451pt;height:.1pt;visibility:visible;mso-wrap-style:square;mso-left-percent:-10001;mso-top-percent:-10001;mso-position-horizontal:absolute;mso-position-horizontal-relative:char;mso-position-vertical:absolute;mso-position-vertical-relative:line;mso-left-percent:-10001;mso-top-percent:-10001;v-text-anchor:top" o:gfxdata="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" filled="f">
+            <o:lock v:ext="edit" rotation="t" aspectratio="t" verticies="t" text="t" shapetype="t"/>
+            <w10:anchorlock/>
+          </v:rect>
         </w:pict>
       </w:r>
     </w:p>
@@ -887,13 +895,15 @@
       </w:pPr>
       <w:r>
         <w:rPr>
-          <w:rFonts w:ascii="Times New Roman" w:eastAsia="Times New Roman" w:hAnsi="Times New Roman" w:cs="Times New Roman"/>
-          <w:kern w:val="0"/>
-          <w:lang w:eastAsia="en-GB"/>
-          <w14:ligatures w14:val="none"/>
-        </w:rPr>
-        <w:pict w14:anchorId="05EB2E56">
-          <v:rect id="_x0000_i1027" style="width:0;height:1.5pt" o:hralign="center" o:hrstd="t" o:hr="t" fillcolor="#a0a0a0" stroked="f"/>
+          <w:noProof/>
+        </w:rPr>
+      </w:r>
+      <w:r>
+        <w:pict w14:anchorId="6113F0C8">
+          <v:rect id="Horizontal Line 3" o:spid="_x0000_s1027" style="width:451pt;height:.1pt;visibility:visible;mso-wrap-style:square;mso-left-percent:-10001;mso-top-percent:-10001;mso-position-horizontal:absolute;mso-position-horizontal-relative:char;mso-position-vertical:absolute;mso-position-vertical-relative:line;mso-left-percent:-10001;mso-top-percent:-10001;v-text-anchor:top" o:gfxdata="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" filled="f">
+            <o:lock v:ext="edit" rotation="t" aspectratio="t" verticies="t" text="t" shapetype="t"/>
+            <w10:anchorlock/>
+          </v:rect>
         </w:pict>
       </w:r>
     </w:p>
@@ -1172,7 +1182,7 @@
         </w:rPr>
       </w:r>
       <w:r>
-        <w:pict w14:anchorId="0451548A">
+        <w:pict w14:anchorId="73001B0E">
           <v:rect id="Horizontal Line 4" o:spid="_x0000_s1026" style="width:451pt;height:.1pt;visibility:visible;mso-wrap-style:square;mso-left-percent:-10001;mso-top-percent:-10001;mso-position-horizontal:absolute;mso-position-horizontal-relative:char;mso-position-vertical:absolute;mso-position-vertical-relative:line;mso-left-percent:-10001;mso-top-percent:-10001;v-text-anchor:top" o:gfxdata="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" filled="f">
             <o:lock v:ext="edit" rotation="t" aspectratio="t" verticies="t" text="t" shapetype="t"/>
             <w10:anchorlock/>

</xml_diff>